<commit_message>
Updated outline (Fall 2026)
</commit_message>
<xml_diff>
--- a/Outline/MiCM - Data Processing in Python Workshop Outline.docx
+++ b/Outline/MiCM - Data Processing in Python Workshop Outline.docx
@@ -133,7 +133,7 @@
           <w:szCs w:val="28"/>
           <w:lang w:val="en-CA"/>
         </w:rPr>
-        <w:t>Summer</w:t>
+        <w:t>Fall</w:t>
       </w:r>
       <w:r>
         <w:rPr>
@@ -181,8 +181,6 @@
         <w:spacing w:after="200" w:line="360" w:lineRule="auto"/>
         <w:rPr>
           <w:rFonts w:eastAsia="Calibri"/>
-          <w:b/>
-          <w:bCs/>
           <w:lang w:val="en-CA"/>
         </w:rPr>
       </w:pPr>
@@ -202,61 +200,7 @@
           <w:bCs/>
           <w:lang w:val="en-CA"/>
         </w:rPr>
-        <w:t>:</w:t>
-      </w:r>
-      <w:r>
-        <w:rPr>
-          <w:rFonts w:eastAsia="Calibri"/>
-          <w:b/>
-          <w:bCs/>
-          <w:lang w:val="en-CA"/>
-        </w:rPr>
-        <w:t xml:space="preserve"> </w:t>
-      </w:r>
-      <w:r>
-        <w:rPr>
-          <w:rFonts w:eastAsia="Calibri"/>
-          <w:b/>
-          <w:bCs/>
-          <w:lang w:val="en-CA"/>
-        </w:rPr>
-        <w:t>Sameena Karsan</w:t>
-      </w:r>
-    </w:p>
-    <w:p>
-      <w:pPr>
-        <w:spacing w:after="200" w:line="360" w:lineRule="auto"/>
-        <w:rPr>
-          <w:rFonts w:eastAsia="Calibri"/>
-          <w:lang w:val="en-CA"/>
-        </w:rPr>
-      </w:pPr>
-      <w:r>
-        <w:rPr>
-          <w:rFonts w:eastAsia="Calibri"/>
-          <w:b/>
-          <w:bCs/>
-          <w:lang w:val="en-CA"/>
-        </w:rPr>
-        <w:t>Facilitator:</w:t>
-      </w:r>
-      <w:r>
-        <w:rPr>
-          <w:rFonts w:eastAsia="Calibri"/>
-          <w:b/>
-          <w:bCs/>
-          <w:lang w:val="en-CA"/>
-        </w:rPr>
-        <w:t xml:space="preserve"> </w:t>
-      </w:r>
-      <w:r>
-        <w:rPr>
-          <w:rFonts w:eastAsia="Calibri"/>
-          <w:b/>
-          <w:bCs/>
-          <w:lang w:val="en-CA"/>
-        </w:rPr>
-        <w:t>Anna Zaider</w:t>
+        <w:t>s: Maria Haddad and Sam Nittala</w:t>
       </w:r>
     </w:p>
     <w:p>
@@ -270,15 +214,6 @@
           <w:lang w:val="en-CA"/>
         </w:rPr>
       </w:pPr>
-      <w:r>
-        <w:rPr>
-          <w:rFonts w:eastAsia="Calibri"/>
-          <w:b/>
-          <w:bCs/>
-          <w:lang w:val="en-CA"/>
-        </w:rPr>
-        <w:t xml:space="preserve">Registration link: </w:t>
-      </w:r>
       <w:hyperlink r:id="rId8" w:history="1">
         <w:r>
           <w:rPr>
@@ -288,7 +223,7 @@
             <w:bCs/>
             <w:lang w:val="en-CA"/>
           </w:rPr>
-          <w:t>https://forms.office.com/pages/responsepage.aspx?id=cZYxzedSaEqvqfz4-J8J6vDmYznQXgROt4BC-q9062NUQTNPNUxZUDM4UEcxOERXUlZBNVFWUVNMRyQlQCN0PWcu&amp;route=shorturl</w:t>
+          <w:t>Registration link</w:t>
         </w:r>
       </w:hyperlink>
     </w:p>
@@ -631,14 +566,12 @@
         </w:rPr>
         <w:t xml:space="preserve">-hour workshop, students will learn basic data processing skills using Python. Attendees will learn how to import code from other modules and packages to take advantage of the existing Python ecosystem. After seeing how to access packages, we will explore popular data analysis packages. We will see how to use NumPy to perform operations on large data arrays and how to use Matplotlib to generate clear data </w:t>
       </w:r>
-      <w:proofErr w:type="spellStart"/>
       <w:r>
         <w:rPr>
           <w:lang w:val="en-US"/>
         </w:rPr>
-        <w:t>visualisations</w:t>
-      </w:r>
-      <w:proofErr w:type="spellEnd"/>
+        <w:t>visualizations</w:t>
+      </w:r>
       <w:r>
         <w:rPr>
           <w:lang w:val="en-US"/>
@@ -794,7 +727,6 @@
         <w:rPr>
           <w:lang w:val="en-US"/>
         </w:rPr>
-        <w:lastRenderedPageBreak/>
         <w:t>Use pandas to represent data stored in tables.</w:t>
       </w:r>
     </w:p>
@@ -858,6 +790,7 @@
           <w:sz w:val="22"/>
           <w:szCs w:val="22"/>
         </w:rPr>
+        <w:lastRenderedPageBreak/>
         <w:t>Module 1 – Modules and Packages (</w:t>
       </w:r>
       <w:r>
@@ -1516,7 +1449,6 @@
         </w:rPr>
         <w:t xml:space="preserve">Module 3 – </w:t>
       </w:r>
-      <w:proofErr w:type="spellStart"/>
       <w:r>
         <w:rPr>
           <w:rFonts w:asciiTheme="minorBidi" w:hAnsiTheme="minorBidi"/>
@@ -1525,9 +1457,8 @@
           <w:sz w:val="22"/>
           <w:szCs w:val="22"/>
         </w:rPr>
-        <w:t>Visualising</w:t>
-      </w:r>
-      <w:proofErr w:type="spellEnd"/>
+        <w:t>Visualizing</w:t>
+      </w:r>
       <w:r>
         <w:rPr>
           <w:rFonts w:asciiTheme="minorBidi" w:hAnsiTheme="minorBidi"/>
@@ -1635,7 +1566,6 @@
           <w:sz w:val="22"/>
           <w:szCs w:val="22"/>
         </w:rPr>
-        <w:lastRenderedPageBreak/>
         <w:t>Creating simple plots, bar plots, histograms, …</w:t>
       </w:r>
     </w:p>
@@ -1653,16 +1583,14 @@
           <w:szCs w:val="22"/>
         </w:rPr>
       </w:pPr>
-      <w:proofErr w:type="spellStart"/>
-      <w:r>
-        <w:rPr>
-          <w:rFonts w:asciiTheme="minorBidi" w:hAnsiTheme="minorBidi"/>
-          <w:sz w:val="22"/>
-          <w:szCs w:val="22"/>
-        </w:rPr>
-        <w:t>Customising</w:t>
-      </w:r>
-      <w:proofErr w:type="spellEnd"/>
+      <w:r>
+        <w:rPr>
+          <w:rFonts w:asciiTheme="minorBidi" w:hAnsiTheme="minorBidi"/>
+          <w:sz w:val="22"/>
+          <w:szCs w:val="22"/>
+        </w:rPr>
+        <w:t>Customizing</w:t>
+      </w:r>
       <w:r>
         <w:rPr>
           <w:rFonts w:asciiTheme="minorBidi" w:hAnsiTheme="minorBidi"/>
@@ -1738,6 +1666,7 @@
           <w:sz w:val="22"/>
           <w:szCs w:val="22"/>
         </w:rPr>
+        <w:lastRenderedPageBreak/>
         <w:t>Generating subplots</w:t>
       </w:r>
     </w:p>

</xml_diff>